<commit_message>
docs(forms): gemini merge FX TASF TTL secrecy
</commit_message>
<xml_diff>
--- a/docs-forms/02_국외여행계약서_희망여행.docx
+++ b/docs-forms/02_국외여행계약서_희망여행.docx
@@ -114,7 +114,20 @@
     </w:p>
     <w:p>
       <w:r>
-        <w:t>여행요금은 실비(항공·숙박·골프·차량 등 실제 지급액)와 알선수수료로 나눕니다. 부가세는 알선수수료에만 붙고 실비는 구분해서 기장합니다. 현금영수증은 10만원 이상 결제분부터 의무로 발행합니다.</w:t>
+        <w:t>여행요금은 실비(항공·숙박·골프·차량 등 실제 지급액)와 알선수수료로 나눕니다. 부가세는 알선수수료에만 붙고 실비는 구분해서 기장합니다. 현금영수증은 10만원 이상 결제분부터 의무로 발행합니다. 세금계산서·현금영수증은 알선수수료분에 한해 발행하며, 국외 지불대행금(그린피·숙박비 등)은 여행 수배 정산 내역서로 영수 증빙을 갈음합니다.</w:t>
+      </w:r>
+    </w:p>
+    <w:p>
+      <w:pPr>
+        <w:pStyle w:val="Heading2"/>
+      </w:pPr>
+      <w:r>
+        <w:t>제3조의2 (환율 연동 특약)</w:t>
+      </w:r>
+    </w:p>
+    <w:p>
+      <w:r>
+        <w:t>외화 기준 금액은 계약 체결일 외환은행 최초 고시 매매기준율을 기준으로 산정합니다. 잔금 결제일 환율이 기준 대비 3% 이상 변동하면 차액을 잔금에 반영해 정산하거나 환급합니다.</w:t>
       </w:r>
     </w:p>
     <w:p>
@@ -205,7 +218,7 @@
     </w:p>
     <w:p>
       <w:r>
-        <w:t>결제는 포트원 결제링크와 계좌이체로 받습니다. 카드번호·유효기간·보안코드 등 카드정보는 직접 수집하지 않습니다. 현금 결제 5만원 초과분은 에스크로(결제대금예치) 이용을 안내합니다.</w:t>
+        <w:t>결제는 포트원 결제링크와 계좌이체로 받습니다. 카드번호·유효기간·보안코드 등 카드정보는 직접 수집하지 않습니다. 현금 결제 5만원 초과분은 에스크로(결제대금예치) 이용을 안내합니다. 항공권 원가는 항공사 또는 B2B 도매사 가맹점 명의로 직접 결제되며, 항공 수속 대행분은 TASF로 분리 승인하거나 별도 정산합니다. 항공사 발권시한(TTL) 내 결제가 안 되면 좌석이 자동 취소되거나 요금이 오를 수 있으며 그 책임은 여행자에게 있습니다. 여신전문금융업법 제19조에 따라 카드 수수료를 여행자에게 가산 청구하지 않으며, 모든 카드 결제는 여행자 본인 명의 카드로만 진행합니다.</w:t>
       </w:r>
     </w:p>
     <w:p>
@@ -218,7 +231,7 @@
     </w:p>
     <w:p>
       <w:r>
-        <w:t>당사는 알선한 예약의 정확성과 출발 전 안내 의무를 집니다. 천재지변·항공사 결항·골프장 휴장 등 당사 귀책이 아닌 사유는 해당 업체 규정과 약관에 따라 처리합니다.</w:t>
+        <w:t>당사는 알선한 예약의 정확성과 출발 전 안내 의무를 집니다. 천재지변·항공사 결항·골프장 휴장 등 당사 귀책이 아닌 사유는 해당 업체 규정과 약관에 따라 처리합니다. 현지 기상악화로 골프장이 공식 코스 클로즈를 선언하면 그린피 환불 또는 우천 쿠폰(Rain Check) 발행을 중개합니다. 여행자가 자발적으로 라운드를 포기하면 환불이 안 되며, 보수공사 등 불가항 사유에는 동급 대체 골프장을 수배해 제시합니다.</w:t>
       </w:r>
     </w:p>
     <w:p>
@@ -310,6 +323,19 @@
     <w:p>
       <w:r>
         <w:t>여권 영문명 오기재로 인한 항공권 재발행 비용은 여행자가 부담합니다. 항공사 스케줄 변경 시 당사는 대체편을 안내할 의무를 지며, 차액은 실비 기준으로 정산합니다.</w:t>
+      </w:r>
+    </w:p>
+    <w:p>
+      <w:pPr>
+        <w:pStyle w:val="Heading2"/>
+      </w:pPr>
+      <w:r>
+        <w:t>제15조의5 (비밀유지)</w:t>
+      </w:r>
+    </w:p>
+    <w:p>
+      <w:r>
+        <w:t>당사는 여행자의 개인정보·여행 동선·거래 내역을 비밀로 유지하며, 계약서에 없는 사항은 관계 법령과 상관례에 따릅니다.</w:t>
       </w:r>
     </w:p>
     <w:p>

</xml_diff>